<commit_message>
Fix DOCX export validity and footer email ordering
</commit_message>
<xml_diff>
--- a/InspectorPro/Resources/template.docx
+++ b/InspectorPro/Resources/template.docx
@@ -130,55 +130,7 @@
         <w:rtl/>
         <w:lang w:eastAsia="he-IL"/>
       </w:rPr>
-      <w:t xml:space="preserve">אבישי </w:t>
-    </w:r>
-    <w:r>
-      <w:rPr>
-        <w:rFonts w:hint="cs"/>
-        <w:color w:val="002060"/>
-        <w:rtl/>
-        <w:lang w:eastAsia="he-IL"/>
-      </w:rPr>
-      <w:t>054-6222577 דוא"</w:t>
-    </w:r>
-    <w:r>
-      <w:rPr>
-        <w:rFonts w:hint="eastAsia"/>
-        <w:color w:val="002060"/>
-        <w:rtl/>
-        <w:lang w:eastAsia="he-IL"/>
-      </w:rPr>
-      <w:t>ל</w:t>
-    </w:r>
-    <w:r>
-      <w:rPr>
-        <w:color w:val="002060"/>
-        <w:lang w:eastAsia="he-IL"/>
-      </w:rPr>
-      <w:t xml:space="preserve"> </w:t>
-    </w:r>
-    <w:hyperlink r:id="rId1" w:history="1">
-      <w:r>
-        <w:rPr>
-          <w:rStyle w:val="Hyperlink"/>
-          <w:lang w:eastAsia="he-IL"/>
-        </w:rPr>
-        <w:t>iter@iter.co.il</w:t>
-      </w:r>
-    </w:hyperlink>
-    <w:r>
-      <w:rPr>
-        <w:color w:val="002060"/>
-        <w:lang w:eastAsia="he-IL"/>
-      </w:rPr>
-      <w:t xml:space="preserve">   </w:t>
-    </w:r>
-    <w:r>
-      <w:rPr>
-        <w:color w:val="002060"/>
-        <w:lang w:eastAsia="he-IL"/>
-      </w:rPr>
-      <w:t xml:space="preserve"> </w:t>
+      <w:t xml:space="preserve">אבישי 054-6222577 מייל iter@iter.co.il</w:t>
     </w:r>
   </w:p>
   <w:p>

</xml_diff>